<commit_message>
Add league name and streaming channels for each matchup to email
</commit_message>
<xml_diff>
--- a/Docs/ThirdSpace_Notes.docx
+++ b/Docs/ThirdSpace_Notes.docx
@@ -1873,6 +1873,156 @@
           <w:bCs/>
         </w:rPr>
         <w:t>All fixed with Claude Code!</w:t>
+      </w:r>
+    </w:p>
+    <w:p>
+      <w:pPr>
+        <w:rPr>
+          <w:b/>
+          <w:bCs/>
+          <w:strike/>
+        </w:rPr>
+      </w:pPr>
+    </w:p>
+    <w:p>
+      <w:pPr>
+        <w:rPr>
+          <w:b/>
+          <w:bCs/>
+          <w:u w:val="single"/>
+        </w:rPr>
+      </w:pPr>
+      <w:r>
+        <w:rPr>
+          <w:b/>
+          <w:bCs/>
+          <w:u w:val="single"/>
+        </w:rPr>
+        <w:t xml:space="preserve">Beta Testing notes </w:t>
+      </w:r>
+    </w:p>
+    <w:p>
+      <w:pPr>
+        <w:rPr>
+          <w:b/>
+          <w:bCs/>
+        </w:rPr>
+      </w:pPr>
+      <w:r>
+        <w:rPr>
+          <w:b/>
+          <w:bCs/>
+        </w:rPr>
+        <w:t>Week 1</w:t>
+      </w:r>
+    </w:p>
+    <w:p>
+      <w:pPr>
+        <w:pStyle w:val="ListParagraph"/>
+        <w:numPr>
+          <w:ilvl w:val="0"/>
+          <w:numId w:val="1"/>
+        </w:numPr>
+      </w:pPr>
+      <w:r>
+        <w:t>Two new users</w:t>
+      </w:r>
+    </w:p>
+    <w:p>
+      <w:pPr>
+        <w:pStyle w:val="ListParagraph"/>
+        <w:numPr>
+          <w:ilvl w:val="0"/>
+          <w:numId w:val="1"/>
+        </w:numPr>
+      </w:pPr>
+      <w:r>
+        <w:t>Sent emails to start march madness.</w:t>
+      </w:r>
+    </w:p>
+    <w:p>
+      <w:pPr>
+        <w:pStyle w:val="ListParagraph"/>
+        <w:numPr>
+          <w:ilvl w:val="0"/>
+          <w:numId w:val="1"/>
+        </w:numPr>
+      </w:pPr>
+      <w:r>
+        <w:t xml:space="preserve">System is working, but copying responses to </w:t>
+      </w:r>
+      <w:proofErr w:type="spellStart"/>
+      <w:r>
+        <w:t>raw_user_data</w:t>
+      </w:r>
+      <w:proofErr w:type="spellEnd"/>
+      <w:r>
+        <w:t xml:space="preserve"> file is a pain in the pass</w:t>
+      </w:r>
+    </w:p>
+    <w:p>
+      <w:pPr>
+        <w:pStyle w:val="ListParagraph"/>
+        <w:numPr>
+          <w:ilvl w:val="1"/>
+          <w:numId w:val="1"/>
+        </w:numPr>
+      </w:pPr>
+      <w:r>
+        <w:t>Need to find improvement</w:t>
+      </w:r>
+    </w:p>
+    <w:p>
+      <w:pPr>
+        <w:pStyle w:val="ListParagraph"/>
+        <w:numPr>
+          <w:ilvl w:val="0"/>
+          <w:numId w:val="1"/>
+        </w:numPr>
+      </w:pPr>
+      <w:r>
+        <w:t>Added TNT, TruTV, FS1 to cable channels to catch other games</w:t>
+      </w:r>
+    </w:p>
+    <w:p>
+      <w:pPr>
+        <w:pStyle w:val="ListParagraph"/>
+        <w:numPr>
+          <w:ilvl w:val="0"/>
+          <w:numId w:val="1"/>
+        </w:numPr>
+        <w:rPr>
+          <w:strike/>
+        </w:rPr>
+      </w:pPr>
+      <w:r>
+        <w:rPr>
+          <w:b/>
+          <w:bCs/>
+          <w:strike/>
+        </w:rPr>
+        <w:t xml:space="preserve">Issue: </w:t>
+      </w:r>
+      <w:r>
+        <w:rPr>
+          <w:strike/>
+        </w:rPr>
+        <w:t>no indication of league or channels in email</w:t>
+      </w:r>
+    </w:p>
+    <w:p>
+      <w:pPr>
+        <w:pStyle w:val="ListParagraph"/>
+        <w:numPr>
+          <w:ilvl w:val="0"/>
+          <w:numId w:val="1"/>
+        </w:numPr>
+        <w:rPr>
+          <w:strike/>
+        </w:rPr>
+      </w:pPr>
+      <w:r>
+        <w:t>Fixed previous issue, added new user, responded to questions on reddit</w:t>
       </w:r>
     </w:p>
     <w:sectPr>

</xml_diff>